<commit_message>
docs: add admin portal presentation walkthrough to study guide
</commit_message>
<xml_diff>
--- a/docs/qa/Tai_Lieu_On_Tap_Bao_Ve.docx
+++ b/docs/qa/Tai_Lieu_On_Tap_Bao_Ve.docx
@@ -9815,6 +9815,996 @@
           <w:szCs w:val="24"/>
         </w:rPr>
         <w:t xml:space="preserve"> trả lời theo Phần 8 và 9, nếu chưa chắc thì nói "phần đó do bạn X phụ trách, em xin phép để bạn ấy trả lời".</w:t>
+      </w:r>
+    </w:p>
+    <w:p>
+      <w:pPr>
+        <w:pStyle w:val="Heading2"/>
+        <w:keepNext/>
+        <w:spacing w:after="120" w:before="240"/>
+      </w:pPr>
+      <w:r>
+        <w:rPr>
+          <w:rFonts w:ascii="Times New Roman" w:cs="Times New Roman" w:eastAsia="Times New Roman" w:hAnsi="Times New Roman"/>
+          <w:b/>
+          <w:bCs/>
+          <w:color w:val="2F5597"/>
+          <w:sz w:val="27"/>
+          <w:szCs w:val="27"/>
+        </w:rPr>
+        <w:t xml:space="preserve">11.4. Thuyết trình riêng trang Admin</w:t>
+      </w:r>
+    </w:p>
+    <w:p>
+      <w:pPr>
+        <w:spacing w:after="120" w:line="300"/>
+        <w:jc w:val="both"/>
+      </w:pPr>
+      <w:r>
+        <w:rPr>
+          <w:rFonts w:ascii="Times New Roman" w:cs="Times New Roman" w:eastAsia="Times New Roman" w:hAnsi="Times New Roman"/>
+          <w:sz w:val="24"/>
+          <w:szCs w:val="24"/>
+        </w:rPr>
+        <w:t xml:space="preserve">Phần này dành khi bạn thuyết trình riêng khu Admin (không chung với luồng HR/Candidate ở 11.2). Trạng thái dưới đây là </w:t>
+      </w:r>
+      <w:r>
+        <w:rPr>
+          <w:rFonts w:ascii="Times New Roman" w:cs="Times New Roman" w:eastAsia="Times New Roman" w:hAnsi="Times New Roman"/>
+          <w:b/>
+          <w:bCs/>
+          <w:sz w:val="24"/>
+          <w:szCs w:val="24"/>
+        </w:rPr>
+        <w:t xml:space="preserve">sau khi đã sửa</w:t>
+      </w:r>
+      <w:r>
+        <w:rPr>
+          <w:rFonts w:ascii="Times New Roman" w:cs="Times New Roman" w:eastAsia="Times New Roman" w:hAnsi="Times New Roman"/>
+          <w:sz w:val="24"/>
+          <w:szCs w:val="24"/>
+        </w:rPr>
+        <w:t xml:space="preserve"> (nhánh main, các PR #226 và #227); trước đó khu Admin có vài lỗi thật, xem bảng cuối mục.</w:t>
+      </w:r>
+    </w:p>
+    <w:p>
+      <w:pPr>
+        <w:pStyle w:val="Heading3"/>
+        <w:keepNext/>
+        <w:spacing w:after="80" w:before="160"/>
+      </w:pPr>
+      <w:r>
+        <w:rPr>
+          <w:rFonts w:ascii="Times New Roman" w:cs="Times New Roman" w:eastAsia="Times New Roman" w:hAnsi="Times New Roman"/>
+          <w:b/>
+          <w:bCs/>
+          <w:color w:val="000000"/>
+          <w:sz w:val="25"/>
+          <w:szCs w:val="25"/>
+        </w:rPr>
+        <w:t xml:space="preserve">Thứ tự trình bày (khoảng 5 phút)</w:t>
+      </w:r>
+    </w:p>
+    <w:p>
+      <w:pPr>
+        <w:pStyle w:val="ListParagraph"/>
+        <w:numPr>
+          <w:ilvl w:val="0"/>
+          <w:numId w:val="9"/>
+        </w:numPr>
+        <w:spacing w:after="70" w:line="290"/>
+        <w:jc w:val="both"/>
+      </w:pPr>
+      <w:r>
+        <w:rPr>
+          <w:rFonts w:ascii="Times New Roman" w:cs="Times New Roman" w:eastAsia="Times New Roman" w:hAnsi="Times New Roman"/>
+          <w:b/>
+          <w:bCs/>
+          <w:sz w:val="24"/>
+          <w:szCs w:val="24"/>
+        </w:rPr>
+        <w:t xml:space="preserve">Dashboard (30 giây):</w:t>
+      </w:r>
+      <w:r>
+        <w:rPr>
+          <w:rFonts w:ascii="Times New Roman" w:cs="Times New Roman" w:eastAsia="Times New Roman" w:hAnsi="Times New Roman"/>
+          <w:sz w:val="24"/>
+          <w:szCs w:val="24"/>
+        </w:rPr>
+        <w:t xml:space="preserve"> mở đầu bằng ô "RAG System Status" — kết nối, cấu hình, vector database (pgvector). Nói: Admin giám sát sức khoẻ dịch vụ AI, RAG lỗi thì có cảnh báo. Chỉ 4 thẻ tổng người dùng, HR, ứng viên, công ty và danh sách đăng ký mới.</w:t>
+      </w:r>
+    </w:p>
+    <w:p>
+      <w:pPr>
+        <w:pStyle w:val="ListParagraph"/>
+        <w:numPr>
+          <w:ilvl w:val="0"/>
+          <w:numId w:val="9"/>
+        </w:numPr>
+        <w:spacing w:after="70" w:line="290"/>
+        <w:jc w:val="both"/>
+      </w:pPr>
+      <w:r>
+        <w:rPr>
+          <w:rFonts w:ascii="Times New Roman" w:cs="Times New Roman" w:eastAsia="Times New Roman" w:hAnsi="Times New Roman"/>
+          <w:b/>
+          <w:bCs/>
+          <w:sz w:val="24"/>
+          <w:szCs w:val="24"/>
+        </w:rPr>
+        <w:t xml:space="preserve">User Management (45 giây):</w:t>
+      </w:r>
+      <w:r>
+        <w:rPr>
+          <w:rFonts w:ascii="Times New Roman" w:cs="Times New Roman" w:eastAsia="Times New Roman" w:hAnsi="Times New Roman"/>
+          <w:sz w:val="24"/>
+          <w:szCs w:val="24"/>
+        </w:rPr>
+        <w:t xml:space="preserve"> tìm một người, mở ngăn chi tiết, chỉ nút Grant Premium và Disable account. Thẻ "Total Users" lấy từ API thống kê thật trên toàn bộ dữ liệu, không đếm theo trang.</w:t>
+      </w:r>
+    </w:p>
+    <w:p>
+      <w:pPr>
+        <w:pStyle w:val="ListParagraph"/>
+        <w:numPr>
+          <w:ilvl w:val="0"/>
+          <w:numId w:val="9"/>
+        </w:numPr>
+        <w:spacing w:after="70" w:line="290"/>
+        <w:jc w:val="both"/>
+      </w:pPr>
+      <w:r>
+        <w:rPr>
+          <w:rFonts w:ascii="Times New Roman" w:cs="Times New Roman" w:eastAsia="Times New Roman" w:hAnsi="Times New Roman"/>
+          <w:b/>
+          <w:bCs/>
+          <w:sz w:val="24"/>
+          <w:szCs w:val="24"/>
+        </w:rPr>
+        <w:t xml:space="preserve">Company Management (20 giây):</w:t>
+      </w:r>
+      <w:r>
+        <w:rPr>
+          <w:rFonts w:ascii="Times New Roman" w:cs="Times New Roman" w:eastAsia="Times New Roman" w:hAnsi="Times New Roman"/>
+          <w:sz w:val="24"/>
+          <w:szCs w:val="24"/>
+        </w:rPr>
+        <w:t xml:space="preserve"> danh sách công ty, mở modal Edit để chỉ rồi bấm Cancel (đừng Save). Phân trang dùng endpoint admin riêng, bấm "Sau" sang trang mới thật.</w:t>
+      </w:r>
+    </w:p>
+    <w:p>
+      <w:pPr>
+        <w:pStyle w:val="ListParagraph"/>
+        <w:numPr>
+          <w:ilvl w:val="0"/>
+          <w:numId w:val="9"/>
+        </w:numPr>
+        <w:spacing w:after="70" w:line="290"/>
+        <w:jc w:val="both"/>
+      </w:pPr>
+      <w:r>
+        <w:rPr>
+          <w:rFonts w:ascii="Times New Roman" w:cs="Times New Roman" w:eastAsia="Times New Roman" w:hAnsi="Times New Roman"/>
+          <w:b/>
+          <w:bCs/>
+          <w:sz w:val="24"/>
+          <w:szCs w:val="24"/>
+        </w:rPr>
+        <w:t xml:space="preserve">Knowledge Base (45 giây):</w:t>
+      </w:r>
+      <w:r>
+        <w:rPr>
+          <w:rFonts w:ascii="Times New Roman" w:cs="Times New Roman" w:eastAsia="Times New Roman" w:hAnsi="Times New Roman"/>
+          <w:sz w:val="24"/>
+          <w:szCs w:val="24"/>
+        </w:rPr>
+        <w:t xml:space="preserve"> kho tri thức SYSTEM dùng chung cho mọi HR, kéo thả tải file, hỗ trợ JSONL. Kể luồng ingest (Queued → chạy nền → callback).</w:t>
+      </w:r>
+    </w:p>
+    <w:p>
+      <w:pPr>
+        <w:pStyle w:val="ListParagraph"/>
+        <w:numPr>
+          <w:ilvl w:val="0"/>
+          <w:numId w:val="9"/>
+        </w:numPr>
+        <w:spacing w:after="70" w:line="290"/>
+        <w:jc w:val="both"/>
+      </w:pPr>
+      <w:r>
+        <w:rPr>
+          <w:rFonts w:ascii="Times New Roman" w:cs="Times New Roman" w:eastAsia="Times New Roman" w:hAnsi="Times New Roman"/>
+          <w:b/>
+          <w:bCs/>
+          <w:sz w:val="24"/>
+          <w:szCs w:val="24"/>
+        </w:rPr>
+        <w:t xml:space="preserve">Marketplace (45 giây):</w:t>
+      </w:r>
+      <w:r>
+        <w:rPr>
+          <w:rFonts w:ascii="Times New Roman" w:cs="Times New Roman" w:eastAsia="Times New Roman" w:hAnsi="Times New Roman"/>
+          <w:sz w:val="24"/>
+          <w:szCs w:val="24"/>
+        </w:rPr>
+        <w:t xml:space="preserve"> thẻ thống kê, top kỹ năng, lọc Practice/Hiring, ghim, gỡ. Bộ thiếu chủ sở hữu hoặc công ty vẫn hiện trong danh sách (ghi "Unknown HR" hoặc "—") thay vì biến mất, nên số liệu và danh sách khớp nhau.</w:t>
+      </w:r>
+    </w:p>
+    <w:p>
+      <w:pPr>
+        <w:pStyle w:val="ListParagraph"/>
+        <w:numPr>
+          <w:ilvl w:val="0"/>
+          <w:numId w:val="9"/>
+        </w:numPr>
+        <w:spacing w:after="70" w:line="290"/>
+        <w:jc w:val="both"/>
+      </w:pPr>
+      <w:r>
+        <w:rPr>
+          <w:rFonts w:ascii="Times New Roman" w:cs="Times New Roman" w:eastAsia="Times New Roman" w:hAnsi="Times New Roman"/>
+          <w:b/>
+          <w:bCs/>
+          <w:sz w:val="24"/>
+          <w:szCs w:val="24"/>
+        </w:rPr>
+        <w:t xml:space="preserve">Subscription Plans (45 giây):</w:t>
+      </w:r>
+      <w:r>
+        <w:rPr>
+          <w:rFonts w:ascii="Times New Roman" w:cs="Times New Roman" w:eastAsia="Times New Roman" w:hAnsi="Times New Roman"/>
+          <w:sz w:val="24"/>
+          <w:szCs w:val="24"/>
+        </w:rPr>
+        <w:t xml:space="preserve"> doanh thu SePay, đơn hàng, giao dịch, chỉnh giá và hạn mức từng gói. Nói đúng: đổi giới hạn gói thì </w:t>
+      </w:r>
+      <w:r>
+        <w:rPr>
+          <w:rFonts w:ascii="Times New Roman" w:cs="Times New Roman" w:eastAsia="Times New Roman" w:hAnsi="Times New Roman"/>
+          <w:b/>
+          <w:bCs/>
+          <w:sz w:val="24"/>
+          <w:szCs w:val="24"/>
+        </w:rPr>
+        <w:t xml:space="preserve">đồng bộ ngay</w:t>
+      </w:r>
+      <w:r>
+        <w:rPr>
+          <w:rFonts w:ascii="Times New Roman" w:cs="Times New Roman" w:eastAsia="Times New Roman" w:hAnsi="Times New Roman"/>
+          <w:sz w:val="24"/>
+          <w:szCs w:val="24"/>
+        </w:rPr>
+        <w:t xml:space="preserve"> vào người đang dùng, không phải "áp dụng từ kỳ sau".</w:t>
+      </w:r>
+    </w:p>
+    <w:p>
+      <w:pPr>
+        <w:pStyle w:val="ListParagraph"/>
+        <w:numPr>
+          <w:ilvl w:val="0"/>
+          <w:numId w:val="9"/>
+        </w:numPr>
+        <w:spacing w:after="70" w:line="290"/>
+        <w:jc w:val="both"/>
+      </w:pPr>
+      <w:r>
+        <w:rPr>
+          <w:rFonts w:ascii="Times New Roman" w:cs="Times New Roman" w:eastAsia="Times New Roman" w:hAnsi="Times New Roman"/>
+          <w:b/>
+          <w:bCs/>
+          <w:sz w:val="24"/>
+          <w:szCs w:val="24"/>
+        </w:rPr>
+        <w:t xml:space="preserve">AI Configuration, Feedback (30 giây):</w:t>
+      </w:r>
+      <w:r>
+        <w:rPr>
+          <w:rFonts w:ascii="Times New Roman" w:cs="Times New Roman" w:eastAsia="Times New Roman" w:hAnsi="Times New Roman"/>
+          <w:sz w:val="24"/>
+          <w:szCs w:val="24"/>
+        </w:rPr>
+        <w:t xml:space="preserve"> chỉ trạng thái RAG, nói rõ đây là trang chỉ đọc.</w:t>
+      </w:r>
+    </w:p>
+    <w:p>
+      <w:pPr>
+        <w:pStyle w:val="ListParagraph"/>
+        <w:numPr>
+          <w:ilvl w:val="0"/>
+          <w:numId w:val="9"/>
+        </w:numPr>
+        <w:spacing w:after="70" w:line="290"/>
+        <w:jc w:val="both"/>
+      </w:pPr>
+      <w:r>
+        <w:rPr>
+          <w:rFonts w:ascii="Times New Roman" w:cs="Times New Roman" w:eastAsia="Times New Roman" w:hAnsi="Times New Roman"/>
+          <w:b/>
+          <w:bCs/>
+          <w:sz w:val="24"/>
+          <w:szCs w:val="24"/>
+        </w:rPr>
+        <w:t xml:space="preserve">Settings, tab General (30 giây):</w:t>
+      </w:r>
+      <w:r>
+        <w:rPr>
+          <w:rFonts w:ascii="Times New Roman" w:cs="Times New Roman" w:eastAsia="Times New Roman" w:hAnsi="Times New Roman"/>
+          <w:sz w:val="24"/>
+          <w:szCs w:val="24"/>
+        </w:rPr>
+        <w:t xml:space="preserve"> chỉ 3 thông số thật — số câu tối thiểu để publish, số bộ ghim tối đa, ngưỡng huy hiệu Trending — và công tắc chống gian lận.</w:t>
+      </w:r>
+    </w:p>
+    <w:p>
+      <w:pPr>
+        <w:pStyle w:val="Heading3"/>
+        <w:keepNext/>
+        <w:spacing w:after="80" w:before="160"/>
+      </w:pPr>
+      <w:r>
+        <w:rPr>
+          <w:rFonts w:ascii="Times New Roman" w:cs="Times New Roman" w:eastAsia="Times New Roman" w:hAnsi="Times New Roman"/>
+          <w:b/>
+          <w:bCs/>
+          <w:color w:val="000000"/>
+          <w:sz w:val="25"/>
+          <w:szCs w:val="25"/>
+        </w:rPr>
+        <w:t xml:space="preserve">Những chỗ đã ghi rõ là bản demo, không cần né tránh</w:t>
+      </w:r>
+    </w:p>
+    <w:p>
+      <w:pPr>
+        <w:pStyle w:val="ListParagraph"/>
+        <w:numPr>
+          <w:ilvl w:val="0"/>
+          <w:numId w:val="2"/>
+        </w:numPr>
+        <w:spacing w:after="70" w:line="290"/>
+        <w:jc w:val="both"/>
+      </w:pPr>
+      <w:r>
+        <w:rPr>
+          <w:rFonts w:ascii="Times New Roman" w:cs="Times New Roman" w:eastAsia="Times New Roman" w:hAnsi="Times New Roman"/>
+          <w:b/>
+          <w:bCs/>
+          <w:sz w:val="24"/>
+          <w:szCs w:val="24"/>
+        </w:rPr>
+        <w:t xml:space="preserve">Analytics:</w:t>
+      </w:r>
+      <w:r>
+        <w:rPr>
+          <w:rFonts w:ascii="Times New Roman" w:cs="Times New Roman" w:eastAsia="Times New Roman" w:hAnsi="Times New Roman"/>
+          <w:sz w:val="24"/>
+          <w:szCs w:val="24"/>
+        </w:rPr>
+        <w:t xml:space="preserve"> đầu trang có banner ghi "dữ liệu mẫu, chưa nối dữ liệu thật". Có thể mở trang này và nói thẳng đây là bản xem trước giao diện.</w:t>
+      </w:r>
+    </w:p>
+    <w:p>
+      <w:pPr>
+        <w:pStyle w:val="ListParagraph"/>
+        <w:numPr>
+          <w:ilvl w:val="0"/>
+          <w:numId w:val="2"/>
+        </w:numPr>
+        <w:spacing w:after="70" w:line="290"/>
+        <w:jc w:val="both"/>
+      </w:pPr>
+      <w:r>
+        <w:rPr>
+          <w:rFonts w:ascii="Times New Roman" w:cs="Times New Roman" w:eastAsia="Times New Roman" w:hAnsi="Times New Roman"/>
+          <w:b/>
+          <w:bCs/>
+          <w:sz w:val="24"/>
+          <w:szCs w:val="24"/>
+        </w:rPr>
+        <w:t xml:space="preserve">Settings, tab Permissions và Notifications:</w:t>
+      </w:r>
+      <w:r>
+        <w:rPr>
+          <w:rFonts w:ascii="Times New Roman" w:cs="Times New Roman" w:eastAsia="Times New Roman" w:hAnsi="Times New Roman"/>
+          <w:sz w:val="24"/>
+          <w:szCs w:val="24"/>
+        </w:rPr>
+        <w:t xml:space="preserve"> có banner "chỉ xem trước, không lưu"; nút Save đã bị vô hiệu.</w:t>
+      </w:r>
+    </w:p>
+    <w:p>
+      <w:pPr>
+        <w:pStyle w:val="Heading3"/>
+        <w:keepNext/>
+        <w:spacing w:after="80" w:before="160"/>
+      </w:pPr>
+      <w:r>
+        <w:rPr>
+          <w:rFonts w:ascii="Times New Roman" w:cs="Times New Roman" w:eastAsia="Times New Roman" w:hAnsi="Times New Roman"/>
+          <w:b/>
+          <w:bCs/>
+          <w:color w:val="000000"/>
+          <w:sz w:val="25"/>
+          <w:szCs w:val="25"/>
+        </w:rPr>
+        <w:t xml:space="preserve">Các lỗi Admin đã tìm thấy và đã sửa (không cần giấu, nêu khi được hỏi)</w:t>
+      </w:r>
+    </w:p>
+    <w:tbl>
+      <w:tblPr>
+        <w:tblW w:type="dxa" w:w="9026"/>
+        <w:tblBorders>
+          <w:top w:val="single" w:color="auto" w:sz="4"/>
+          <w:left w:val="single" w:color="auto" w:sz="4"/>
+          <w:bottom w:val="single" w:color="auto" w:sz="4"/>
+          <w:right w:val="single" w:color="auto" w:sz="4"/>
+          <w:insideH w:val="single" w:color="auto" w:sz="4"/>
+          <w:insideV w:val="single" w:color="auto" w:sz="4"/>
+        </w:tblBorders>
+      </w:tblPr>
+      <w:tblGrid>
+        <w:gridCol w:w="3200"/>
+        <w:gridCol w:w="5826"/>
+      </w:tblGrid>
+      <w:tr>
+        <w:trPr>
+          <w:tblHeader/>
+        </w:trPr>
+        <w:tc>
+          <w:tcPr>
+            <w:tcW w:type="dxa" w:w="3200"/>
+            <w:tcBorders>
+              <w:top w:val="single" w:color="808080" w:sz="4"/>
+              <w:left w:val="single" w:color="808080" w:sz="4"/>
+              <w:bottom w:val="single" w:color="808080" w:sz="4"/>
+              <w:right w:val="single" w:color="808080" w:sz="4"/>
+            </w:tcBorders>
+            <w:shd w:fill="2F5597" w:color="auto" w:val="clear"/>
+            <w:tcMar>
+              <w:top w:type="dxa" w:w="60"/>
+              <w:left w:type="dxa" w:w="100"/>
+              <w:bottom w:type="dxa" w:w="60"/>
+              <w:right w:type="dxa" w:w="100"/>
+            </w:tcMar>
+          </w:tcPr>
+          <w:p>
+            <w:pPr>
+              <w:spacing w:after="40"/>
+            </w:pPr>
+            <w:r>
+              <w:rPr>
+                <w:rFonts w:ascii="Times New Roman" w:cs="Times New Roman" w:eastAsia="Times New Roman" w:hAnsi="Times New Roman"/>
+                <w:b/>
+                <w:bCs/>
+                <w:color w:val="FFFFFF"/>
+                <w:sz w:val="22"/>
+                <w:szCs w:val="22"/>
+              </w:rPr>
+              <w:t xml:space="preserve">Trước</w:t>
+            </w:r>
+          </w:p>
+        </w:tc>
+        <w:tc>
+          <w:tcPr>
+            <w:tcW w:type="dxa" w:w="5826"/>
+            <w:tcBorders>
+              <w:top w:val="single" w:color="808080" w:sz="4"/>
+              <w:left w:val="single" w:color="808080" w:sz="4"/>
+              <w:bottom w:val="single" w:color="808080" w:sz="4"/>
+              <w:right w:val="single" w:color="808080" w:sz="4"/>
+            </w:tcBorders>
+            <w:shd w:fill="2F5597" w:color="auto" w:val="clear"/>
+            <w:tcMar>
+              <w:top w:type="dxa" w:w="60"/>
+              <w:left w:type="dxa" w:w="100"/>
+              <w:bottom w:type="dxa" w:w="60"/>
+              <w:right w:type="dxa" w:w="100"/>
+            </w:tcMar>
+          </w:tcPr>
+          <w:p>
+            <w:pPr>
+              <w:spacing w:after="40"/>
+            </w:pPr>
+            <w:r>
+              <w:rPr>
+                <w:rFonts w:ascii="Times New Roman" w:cs="Times New Roman" w:eastAsia="Times New Roman" w:hAnsi="Times New Roman"/>
+                <w:b/>
+                <w:bCs/>
+                <w:color w:val="FFFFFF"/>
+                <w:sz w:val="22"/>
+                <w:szCs w:val="22"/>
+              </w:rPr>
+              <w:t xml:space="preserve">Sau</w:t>
+            </w:r>
+          </w:p>
+        </w:tc>
+      </w:tr>
+      <w:tr>
+        <w:trPr>
+          <w:cantSplit/>
+        </w:trPr>
+        <w:tc>
+          <w:tcPr>
+            <w:tcW w:type="dxa" w:w="3200"/>
+            <w:tcBorders>
+              <w:top w:val="single" w:color="808080" w:sz="4"/>
+              <w:left w:val="single" w:color="808080" w:sz="4"/>
+              <w:bottom w:val="single" w:color="808080" w:sz="4"/>
+              <w:right w:val="single" w:color="808080" w:sz="4"/>
+            </w:tcBorders>
+            <w:tcMar>
+              <w:top w:type="dxa" w:w="60"/>
+              <w:left w:type="dxa" w:w="100"/>
+              <w:bottom w:type="dxa" w:w="60"/>
+              <w:right w:type="dxa" w:w="100"/>
+            </w:tcMar>
+          </w:tcPr>
+          <w:p>
+            <w:pPr>
+              <w:spacing w:after="40"/>
+            </w:pPr>
+            <w:r>
+              <w:rPr>
+                <w:rFonts w:ascii="Times New Roman" w:cs="Times New Roman" w:eastAsia="Times New Roman" w:hAnsi="Times New Roman"/>
+                <w:sz w:val="22"/>
+                <w:szCs w:val="22"/>
+              </w:rPr>
+              <w:t xml:space="preserve">Huy hiệu "3" cứng ở sidebar, luôn hiện dù không có gì chờ xử lý</w:t>
+            </w:r>
+          </w:p>
+        </w:tc>
+        <w:tc>
+          <w:tcPr>
+            <w:tcW w:type="dxa" w:w="5826"/>
+            <w:tcBorders>
+              <w:top w:val="single" w:color="808080" w:sz="4"/>
+              <w:left w:val="single" w:color="808080" w:sz="4"/>
+              <w:bottom w:val="single" w:color="808080" w:sz="4"/>
+              <w:right w:val="single" w:color="808080" w:sz="4"/>
+            </w:tcBorders>
+            <w:tcMar>
+              <w:top w:type="dxa" w:w="60"/>
+              <w:left w:type="dxa" w:w="100"/>
+              <w:bottom w:type="dxa" w:w="60"/>
+              <w:right w:type="dxa" w:w="100"/>
+            </w:tcMar>
+          </w:tcPr>
+          <w:p>
+            <w:pPr>
+              <w:spacing w:after="40"/>
+            </w:pPr>
+            <w:r>
+              <w:rPr>
+                <w:rFonts w:ascii="Times New Roman" w:cs="Times New Roman" w:eastAsia="Times New Roman" w:hAnsi="Times New Roman"/>
+                <w:sz w:val="22"/>
+                <w:szCs w:val="22"/>
+              </w:rPr>
+              <w:t xml:space="preserve">Bỏ hẳn khỏi giao diện</w:t>
+            </w:r>
+          </w:p>
+        </w:tc>
+      </w:tr>
+      <w:tr>
+        <w:trPr>
+          <w:cantSplit/>
+        </w:trPr>
+        <w:tc>
+          <w:tcPr>
+            <w:tcW w:type="dxa" w:w="3200"/>
+            <w:tcBorders>
+              <w:top w:val="single" w:color="808080" w:sz="4"/>
+              <w:left w:val="single" w:color="808080" w:sz="4"/>
+              <w:bottom w:val="single" w:color="808080" w:sz="4"/>
+              <w:right w:val="single" w:color="808080" w:sz="4"/>
+            </w:tcBorders>
+            <w:tcMar>
+              <w:top w:type="dxa" w:w="60"/>
+              <w:left w:type="dxa" w:w="100"/>
+              <w:bottom w:type="dxa" w:w="60"/>
+              <w:right w:type="dxa" w:w="100"/>
+            </w:tcMar>
+          </w:tcPr>
+          <w:p>
+            <w:pPr>
+              <w:spacing w:after="40"/>
+            </w:pPr>
+            <w:r>
+              <w:rPr>
+                <w:rFonts w:ascii="Times New Roman" w:cs="Times New Roman" w:eastAsia="Times New Roman" w:hAnsi="Times New Roman"/>
+                <w:sz w:val="22"/>
+                <w:szCs w:val="22"/>
+              </w:rPr>
+              <w:t xml:space="preserve">Bấm "Sau" ở Companies lặp lại đúng danh sách cũ (backend không phân trang, giao diện Việt viết cứng trên bản tiếng Anh)</w:t>
+            </w:r>
+          </w:p>
+        </w:tc>
+        <w:tc>
+          <w:tcPr>
+            <w:tcW w:type="dxa" w:w="5826"/>
+            <w:tcBorders>
+              <w:top w:val="single" w:color="808080" w:sz="4"/>
+              <w:left w:val="single" w:color="808080" w:sz="4"/>
+              <w:bottom w:val="single" w:color="808080" w:sz="4"/>
+              <w:right w:val="single" w:color="808080" w:sz="4"/>
+            </w:tcBorders>
+            <w:tcMar>
+              <w:top w:type="dxa" w:w="60"/>
+              <w:left w:type="dxa" w:w="100"/>
+              <w:bottom w:type="dxa" w:w="60"/>
+              <w:right w:type="dxa" w:w="100"/>
+            </w:tcMar>
+          </w:tcPr>
+          <w:p>
+            <w:pPr>
+              <w:spacing w:after="40"/>
+            </w:pPr>
+            <w:r>
+              <w:rPr>
+                <w:rFonts w:ascii="Times New Roman" w:cs="Times New Roman" w:eastAsia="Times New Roman" w:hAnsi="Times New Roman"/>
+                <w:sz w:val="22"/>
+                <w:szCs w:val="22"/>
+              </w:rPr>
+              <w:t xml:space="preserve">Dùng endpoint /api/admin/companies có phân trang thật, chữ chuyển sang i18n</w:t>
+            </w:r>
+          </w:p>
+        </w:tc>
+      </w:tr>
+      <w:tr>
+        <w:trPr>
+          <w:cantSplit/>
+        </w:trPr>
+        <w:tc>
+          <w:tcPr>
+            <w:tcW w:type="dxa" w:w="3200"/>
+            <w:tcBorders>
+              <w:top w:val="single" w:color="808080" w:sz="4"/>
+              <w:left w:val="single" w:color="808080" w:sz="4"/>
+              <w:bottom w:val="single" w:color="808080" w:sz="4"/>
+              <w:right w:val="single" w:color="808080" w:sz="4"/>
+            </w:tcBorders>
+            <w:tcMar>
+              <w:top w:type="dxa" w:w="60"/>
+              <w:left w:type="dxa" w:w="100"/>
+              <w:bottom w:type="dxa" w:w="60"/>
+              <w:right w:type="dxa" w:w="100"/>
+            </w:tcMar>
+          </w:tcPr>
+          <w:p>
+            <w:pPr>
+              <w:spacing w:after="40"/>
+            </w:pPr>
+            <w:r>
+              <w:rPr>
+                <w:rFonts w:ascii="Times New Roman" w:cs="Times New Roman" w:eastAsia="Times New Roman" w:hAnsi="Times New Roman"/>
+                <w:sz w:val="22"/>
+                <w:szCs w:val="22"/>
+              </w:rPr>
+              <w:t xml:space="preserve">Marketplace: thẻ thống kê ghi 94 bộ nhưng danh sách chỉ có 11 (join cứng loại bỏ bộ thiếu chủ sở hữu hoặc công ty)</w:t>
+            </w:r>
+          </w:p>
+        </w:tc>
+        <w:tc>
+          <w:tcPr>
+            <w:tcW w:type="dxa" w:w="5826"/>
+            <w:tcBorders>
+              <w:top w:val="single" w:color="808080" w:sz="4"/>
+              <w:left w:val="single" w:color="808080" w:sz="4"/>
+              <w:bottom w:val="single" w:color="808080" w:sz="4"/>
+              <w:right w:val="single" w:color="808080" w:sz="4"/>
+            </w:tcBorders>
+            <w:tcMar>
+              <w:top w:type="dxa" w:w="60"/>
+              <w:left w:type="dxa" w:w="100"/>
+              <w:bottom w:type="dxa" w:w="60"/>
+              <w:right w:type="dxa" w:w="100"/>
+            </w:tcMar>
+          </w:tcPr>
+          <w:p>
+            <w:pPr>
+              <w:spacing w:after="40"/>
+            </w:pPr>
+            <w:r>
+              <w:rPr>
+                <w:rFonts w:ascii="Times New Roman" w:cs="Times New Roman" w:eastAsia="Times New Roman" w:hAnsi="Times New Roman"/>
+                <w:sz w:val="22"/>
+                <w:szCs w:val="22"/>
+              </w:rPr>
+              <w:t xml:space="preserve">Đổi sang left join, số liệu và danh sách khớp nhau</w:t>
+            </w:r>
+          </w:p>
+        </w:tc>
+      </w:tr>
+      <w:tr>
+        <w:trPr>
+          <w:cantSplit/>
+        </w:trPr>
+        <w:tc>
+          <w:tcPr>
+            <w:tcW w:type="dxa" w:w="3200"/>
+            <w:tcBorders>
+              <w:top w:val="single" w:color="808080" w:sz="4"/>
+              <w:left w:val="single" w:color="808080" w:sz="4"/>
+              <w:bottom w:val="single" w:color="808080" w:sz="4"/>
+              <w:right w:val="single" w:color="808080" w:sz="4"/>
+            </w:tcBorders>
+            <w:tcMar>
+              <w:top w:type="dxa" w:w="60"/>
+              <w:left w:type="dxa" w:w="100"/>
+              <w:bottom w:type="dxa" w:w="60"/>
+              <w:right w:type="dxa" w:w="100"/>
+            </w:tcMar>
+          </w:tcPr>
+          <w:p>
+            <w:pPr>
+              <w:spacing w:after="40"/>
+            </w:pPr>
+            <w:r>
+              <w:rPr>
+                <w:rFonts w:ascii="Times New Roman" w:cs="Times New Roman" w:eastAsia="Times New Roman" w:hAnsi="Times New Roman"/>
+                <w:sz w:val="22"/>
+                <w:szCs w:val="22"/>
+              </w:rPr>
+              <w:t xml:space="preserve">Thẻ "Active Users"/"Pending Approval" chỉ đếm trong 10 dòng của trang đang xem</w:t>
+            </w:r>
+          </w:p>
+        </w:tc>
+        <w:tc>
+          <w:tcPr>
+            <w:tcW w:type="dxa" w:w="5826"/>
+            <w:tcBorders>
+              <w:top w:val="single" w:color="808080" w:sz="4"/>
+              <w:left w:val="single" w:color="808080" w:sz="4"/>
+              <w:bottom w:val="single" w:color="808080" w:sz="4"/>
+              <w:right w:val="single" w:color="808080" w:sz="4"/>
+            </w:tcBorders>
+            <w:tcMar>
+              <w:top w:type="dxa" w:w="60"/>
+              <w:left w:type="dxa" w:w="100"/>
+              <w:bottom w:type="dxa" w:w="60"/>
+              <w:right w:type="dxa" w:w="100"/>
+            </w:tcMar>
+          </w:tcPr>
+          <w:p>
+            <w:pPr>
+              <w:spacing w:after="40"/>
+            </w:pPr>
+            <w:r>
+              <w:rPr>
+                <w:rFonts w:ascii="Times New Roman" w:cs="Times New Roman" w:eastAsia="Times New Roman" w:hAnsi="Times New Roman"/>
+                <w:sz w:val="22"/>
+                <w:szCs w:val="22"/>
+              </w:rPr>
+              <w:t xml:space="preserve">Thêm endpoint GET /api/admin/users/stats, đếm trên toàn bộ dữ liệu</w:t>
+            </w:r>
+          </w:p>
+        </w:tc>
+      </w:tr>
+      <w:tr>
+        <w:trPr>
+          <w:cantSplit/>
+        </w:trPr>
+        <w:tc>
+          <w:tcPr>
+            <w:tcW w:type="dxa" w:w="3200"/>
+            <w:tcBorders>
+              <w:top w:val="single" w:color="808080" w:sz="4"/>
+              <w:left w:val="single" w:color="808080" w:sz="4"/>
+              <w:bottom w:val="single" w:color="808080" w:sz="4"/>
+              <w:right w:val="single" w:color="808080" w:sz="4"/>
+            </w:tcBorders>
+            <w:tcMar>
+              <w:top w:type="dxa" w:w="60"/>
+              <w:left w:type="dxa" w:w="100"/>
+              <w:bottom w:type="dxa" w:w="60"/>
+              <w:right w:type="dxa" w:w="100"/>
+            </w:tcMar>
+          </w:tcPr>
+          <w:p>
+            <w:pPr>
+              <w:spacing w:after="40"/>
+            </w:pPr>
+            <w:r>
+              <w:rPr>
+                <w:rFonts w:ascii="Times New Roman" w:cs="Times New Roman" w:eastAsia="Times New Roman" w:hAnsi="Times New Roman"/>
+                <w:sz w:val="22"/>
+                <w:szCs w:val="22"/>
+              </w:rPr>
+              <w:t xml:space="preserve">Settings, tab General có 4 ô (Platform Name, Default Question Count, Max JDs Per Day, Session Timeout) sửa xong bấm Save vẫn báo thành công nhưng backend không lưu</w:t>
+            </w:r>
+          </w:p>
+        </w:tc>
+        <w:tc>
+          <w:tcPr>
+            <w:tcW w:type="dxa" w:w="5826"/>
+            <w:tcBorders>
+              <w:top w:val="single" w:color="808080" w:sz="4"/>
+              <w:left w:val="single" w:color="808080" w:sz="4"/>
+              <w:bottom w:val="single" w:color="808080" w:sz="4"/>
+              <w:right w:val="single" w:color="808080" w:sz="4"/>
+            </w:tcBorders>
+            <w:tcMar>
+              <w:top w:type="dxa" w:w="60"/>
+              <w:left w:type="dxa" w:w="100"/>
+              <w:bottom w:type="dxa" w:w="60"/>
+              <w:right w:type="dxa" w:w="100"/>
+            </w:tcMar>
+          </w:tcPr>
+          <w:p>
+            <w:pPr>
+              <w:spacing w:after="40"/>
+            </w:pPr>
+            <w:r>
+              <w:rPr>
+                <w:rFonts w:ascii="Times New Roman" w:cs="Times New Roman" w:eastAsia="Times New Roman" w:hAnsi="Times New Roman"/>
+                <w:sz w:val="22"/>
+                <w:szCs w:val="22"/>
+              </w:rPr>
+              <w:t xml:space="preserve">Gỡ 4 ô khỏi giao diện, chỉ giữ 3 thông số thật có API lưu</w:t>
+            </w:r>
+          </w:p>
+        </w:tc>
+      </w:tr>
+      <w:tr>
+        <w:trPr>
+          <w:cantSplit/>
+        </w:trPr>
+        <w:tc>
+          <w:tcPr>
+            <w:tcW w:type="dxa" w:w="3200"/>
+            <w:tcBorders>
+              <w:top w:val="single" w:color="808080" w:sz="4"/>
+              <w:left w:val="single" w:color="808080" w:sz="4"/>
+              <w:bottom w:val="single" w:color="808080" w:sz="4"/>
+              <w:right w:val="single" w:color="808080" w:sz="4"/>
+            </w:tcBorders>
+            <w:tcMar>
+              <w:top w:type="dxa" w:w="60"/>
+              <w:left w:type="dxa" w:w="100"/>
+              <w:bottom w:type="dxa" w:w="60"/>
+              <w:right w:type="dxa" w:w="100"/>
+            </w:tcMar>
+          </w:tcPr>
+          <w:p>
+            <w:pPr>
+              <w:spacing w:after="40"/>
+            </w:pPr>
+            <w:r>
+              <w:rPr>
+                <w:rFonts w:ascii="Times New Roman" w:cs="Times New Roman" w:eastAsia="Times New Roman" w:hAnsi="Times New Roman"/>
+                <w:sz w:val="22"/>
+                <w:szCs w:val="22"/>
+              </w:rPr>
+              <w:t xml:space="preserve">Thẻ marketplace chưa có lượt làm nào hiện "0.0 / 5"</w:t>
+            </w:r>
+          </w:p>
+        </w:tc>
+        <w:tc>
+          <w:tcPr>
+            <w:tcW w:type="dxa" w:w="5826"/>
+            <w:tcBorders>
+              <w:top w:val="single" w:color="808080" w:sz="4"/>
+              <w:left w:val="single" w:color="808080" w:sz="4"/>
+              <w:bottom w:val="single" w:color="808080" w:sz="4"/>
+              <w:right w:val="single" w:color="808080" w:sz="4"/>
+            </w:tcBorders>
+            <w:tcMar>
+              <w:top w:type="dxa" w:w="60"/>
+              <w:left w:type="dxa" w:w="100"/>
+              <w:bottom w:type="dxa" w:w="60"/>
+              <w:right w:type="dxa" w:w="100"/>
+            </w:tcMar>
+          </w:tcPr>
+          <w:p>
+            <w:pPr>
+              <w:spacing w:after="40"/>
+            </w:pPr>
+            <w:r>
+              <w:rPr>
+                <w:rFonts w:ascii="Times New Roman" w:cs="Times New Roman" w:eastAsia="Times New Roman" w:hAnsi="Times New Roman"/>
+                <w:sz w:val="22"/>
+                <w:szCs w:val="22"/>
+              </w:rPr>
+              <w:t xml:space="preserve">Ẩn dòng đánh giá khi bộ chưa có điểm</w:t>
+            </w:r>
+          </w:p>
+        </w:tc>
+      </w:tr>
+    </w:tbl>
+    <w:p>
+      <w:pPr>
+        <w:spacing w:after="100"/>
+      </w:pPr>
+      <w:r>
+        <w:rPr>
+          <w:rFonts w:ascii="Times New Roman" w:cs="Times New Roman" w:eastAsia="Times New Roman" w:hAnsi="Times New Roman"/>
+          <w:sz w:val="24"/>
+          <w:szCs w:val="24"/>
+        </w:rPr>
+        <w:t xml:space="preserve"/>
+      </w:r>
+    </w:p>
+    <w:p>
+      <w:pPr>
+        <w:pStyle w:val="Heading3"/>
+        <w:keepNext/>
+        <w:spacing w:after="80" w:before="160"/>
+      </w:pPr>
+      <w:r>
+        <w:rPr>
+          <w:rFonts w:ascii="Times New Roman" w:cs="Times New Roman" w:eastAsia="Times New Roman" w:hAnsi="Times New Roman"/>
+          <w:b/>
+          <w:bCs/>
+          <w:color w:val="000000"/>
+          <w:sz w:val="25"/>
+          <w:szCs w:val="25"/>
+        </w:rPr>
+        <w:t xml:space="preserve">Vẫn cần thận trọng khi demo</w:t>
+      </w:r>
+    </w:p>
+    <w:p>
+      <w:pPr>
+        <w:pStyle w:val="ListParagraph"/>
+        <w:numPr>
+          <w:ilvl w:val="0"/>
+          <w:numId w:val="2"/>
+        </w:numPr>
+        <w:spacing w:after="70" w:line="290"/>
+        <w:jc w:val="both"/>
+      </w:pPr>
+      <w:r>
+        <w:rPr>
+          <w:rFonts w:ascii="Times New Roman" w:cs="Times New Roman" w:eastAsia="Times New Roman" w:hAnsi="Times New Roman"/>
+          <w:sz w:val="24"/>
+          <w:szCs w:val="24"/>
+        </w:rPr>
+        <w:t xml:space="preserve">Kiểm tra trạng thái RAG ở Dashboard trước khi bắt đầu.</w:t>
+      </w:r>
+    </w:p>
+    <w:p>
+      <w:pPr>
+        <w:pStyle w:val="ListParagraph"/>
+        <w:numPr>
+          <w:ilvl w:val="0"/>
+          <w:numId w:val="2"/>
+        </w:numPr>
+        <w:spacing w:after="70" w:line="290"/>
+        <w:jc w:val="both"/>
+      </w:pPr>
+      <w:r>
+        <w:rPr>
+          <w:rFonts w:ascii="Times New Roman" w:cs="Times New Roman" w:eastAsia="Times New Roman" w:hAnsi="Times New Roman"/>
+          <w:sz w:val="24"/>
+          <w:szCs w:val="24"/>
+        </w:rPr>
+        <w:t xml:space="preserve">Đừng bấm Unpublish hay đổi giới hạn gói trên dữ liệu production thật nếu không cố ý — các thao tác này có tác dụng ngay và ảnh hưởng người dùng thật.</w:t>
+      </w:r>
+    </w:p>
+    <w:p>
+      <w:pPr>
+        <w:pStyle w:val="ListParagraph"/>
+        <w:numPr>
+          <w:ilvl w:val="0"/>
+          <w:numId w:val="2"/>
+        </w:numPr>
+        <w:spacing w:after="70" w:line="290"/>
+        <w:jc w:val="both"/>
+      </w:pPr>
+      <w:r>
+        <w:rPr>
+          <w:rFonts w:ascii="Times New Roman" w:cs="Times New Roman" w:eastAsia="Times New Roman" w:hAnsi="Times New Roman"/>
+          <w:b/>
+          <w:bCs/>
+          <w:sz w:val="24"/>
+          <w:szCs w:val="24"/>
+        </w:rPr>
+        <w:t xml:space="preserve">Leaderboard vẫn là dữ liệu giả</w:t>
+      </w:r>
+      <w:r>
+        <w:rPr>
+          <w:rFonts w:ascii="Times New Roman" w:cs="Times New Roman" w:eastAsia="Times New Roman" w:hAnsi="Times New Roman"/>
+          <w:sz w:val="24"/>
+          <w:szCs w:val="24"/>
+        </w:rPr>
+        <w:t xml:space="preserve">, chưa nối XP thật — nếu bị hỏi, nói đây là bản demo giao diện, dashboard mới dùng XP và streak thật (xem Phần 8).</w:t>
       </w:r>
     </w:p>
     <w:p>
@@ -12423,7 +13413,7 @@
         <w:pStyle w:val="ListParagraph"/>
         <w:numPr>
           <w:ilvl w:val="0"/>
-          <w:numId w:val="9"/>
+          <w:numId w:val="10"/>
         </w:numPr>
         <w:spacing w:after="70" w:line="290"/>
         <w:jc w:val="both"/>
@@ -12460,7 +13450,7 @@
         <w:pStyle w:val="ListParagraph"/>
         <w:numPr>
           <w:ilvl w:val="0"/>
-          <w:numId w:val="9"/>
+          <w:numId w:val="10"/>
         </w:numPr>
         <w:spacing w:after="70" w:line="290"/>
         <w:jc w:val="both"/>
@@ -12489,7 +13479,7 @@
         <w:pStyle w:val="ListParagraph"/>
         <w:numPr>
           <w:ilvl w:val="0"/>
-          <w:numId w:val="9"/>
+          <w:numId w:val="10"/>
         </w:numPr>
         <w:spacing w:after="70" w:line="290"/>
         <w:jc w:val="both"/>
@@ -12544,7 +13534,7 @@
         <w:pStyle w:val="ListParagraph"/>
         <w:numPr>
           <w:ilvl w:val="0"/>
-          <w:numId w:val="9"/>
+          <w:numId w:val="10"/>
         </w:numPr>
         <w:spacing w:after="70" w:line="290"/>
         <w:jc w:val="both"/>
@@ -12599,7 +13589,7 @@
         <w:pStyle w:val="ListParagraph"/>
         <w:numPr>
           <w:ilvl w:val="0"/>
-          <w:numId w:val="9"/>
+          <w:numId w:val="10"/>
         </w:numPr>
         <w:spacing w:after="70" w:line="290"/>
         <w:jc w:val="both"/>
@@ -12636,7 +13626,7 @@
         <w:pStyle w:val="ListParagraph"/>
         <w:numPr>
           <w:ilvl w:val="0"/>
-          <w:numId w:val="9"/>
+          <w:numId w:val="10"/>
         </w:numPr>
         <w:spacing w:after="70" w:line="290"/>
         <w:jc w:val="both"/>
@@ -14974,7 +15964,7 @@
         <w:pStyle w:val="ListParagraph"/>
         <w:numPr>
           <w:ilvl w:val="0"/>
-          <w:numId w:val="10"/>
+          <w:numId w:val="11"/>
         </w:numPr>
         <w:spacing w:after="70" w:line="290"/>
         <w:jc w:val="both"/>
@@ -15021,7 +16011,7 @@
         <w:pStyle w:val="ListParagraph"/>
         <w:numPr>
           <w:ilvl w:val="0"/>
-          <w:numId w:val="10"/>
+          <w:numId w:val="11"/>
         </w:numPr>
         <w:spacing w:after="70" w:line="290"/>
         <w:jc w:val="both"/>
@@ -15050,7 +16040,7 @@
         <w:pStyle w:val="ListParagraph"/>
         <w:numPr>
           <w:ilvl w:val="0"/>
-          <w:numId w:val="10"/>
+          <w:numId w:val="11"/>
         </w:numPr>
         <w:spacing w:after="70" w:line="290"/>
         <w:jc w:val="both"/>
@@ -15079,7 +16069,7 @@
         <w:pStyle w:val="ListParagraph"/>
         <w:numPr>
           <w:ilvl w:val="0"/>
-          <w:numId w:val="10"/>
+          <w:numId w:val="11"/>
         </w:numPr>
         <w:spacing w:after="70" w:line="290"/>
         <w:jc w:val="both"/>
@@ -15126,7 +16116,7 @@
         <w:pStyle w:val="ListParagraph"/>
         <w:numPr>
           <w:ilvl w:val="0"/>
-          <w:numId w:val="10"/>
+          <w:numId w:val="11"/>
         </w:numPr>
         <w:spacing w:after="70" w:line="290"/>
         <w:jc w:val="both"/>
@@ -15173,7 +16163,7 @@
         <w:pStyle w:val="ListParagraph"/>
         <w:numPr>
           <w:ilvl w:val="0"/>
-          <w:numId w:val="10"/>
+          <w:numId w:val="11"/>
         </w:numPr>
         <w:spacing w:after="70" w:line="290"/>
         <w:jc w:val="both"/>
@@ -15202,7 +16192,7 @@
         <w:pStyle w:val="ListParagraph"/>
         <w:numPr>
           <w:ilvl w:val="0"/>
-          <w:numId w:val="10"/>
+          <w:numId w:val="11"/>
         </w:numPr>
         <w:spacing w:after="70" w:line="290"/>
         <w:jc w:val="both"/>
@@ -15249,7 +16239,7 @@
         <w:pStyle w:val="ListParagraph"/>
         <w:numPr>
           <w:ilvl w:val="0"/>
-          <w:numId w:val="10"/>
+          <w:numId w:val="11"/>
         </w:numPr>
         <w:spacing w:after="70" w:line="290"/>
         <w:jc w:val="both"/>
@@ -15286,7 +16276,7 @@
         <w:pStyle w:val="ListParagraph"/>
         <w:numPr>
           <w:ilvl w:val="0"/>
-          <w:numId w:val="10"/>
+          <w:numId w:val="11"/>
         </w:numPr>
         <w:spacing w:after="70" w:line="290"/>
         <w:jc w:val="both"/>
@@ -15333,7 +16323,7 @@
         <w:pStyle w:val="ListParagraph"/>
         <w:numPr>
           <w:ilvl w:val="0"/>
-          <w:numId w:val="10"/>
+          <w:numId w:val="11"/>
         </w:numPr>
         <w:spacing w:after="70" w:line="290"/>
         <w:jc w:val="both"/>
@@ -17483,7 +18473,7 @@
         <w:pStyle w:val="ListParagraph"/>
         <w:numPr>
           <w:ilvl w:val="0"/>
-          <w:numId w:val="11"/>
+          <w:numId w:val="12"/>
         </w:numPr>
         <w:spacing w:after="70" w:line="290"/>
         <w:jc w:val="both"/>
@@ -17520,7 +18510,7 @@
         <w:pStyle w:val="ListParagraph"/>
         <w:numPr>
           <w:ilvl w:val="0"/>
-          <w:numId w:val="11"/>
+          <w:numId w:val="12"/>
         </w:numPr>
         <w:spacing w:after="70" w:line="290"/>
         <w:jc w:val="both"/>
@@ -17549,7 +18539,7 @@
         <w:pStyle w:val="ListParagraph"/>
         <w:numPr>
           <w:ilvl w:val="0"/>
-          <w:numId w:val="11"/>
+          <w:numId w:val="12"/>
         </w:numPr>
         <w:spacing w:after="70" w:line="290"/>
         <w:jc w:val="both"/>
@@ -17614,7 +18604,7 @@
         <w:pStyle w:val="ListParagraph"/>
         <w:numPr>
           <w:ilvl w:val="0"/>
-          <w:numId w:val="11"/>
+          <w:numId w:val="12"/>
         </w:numPr>
         <w:spacing w:after="70" w:line="290"/>
         <w:jc w:val="both"/>
@@ -17643,7 +18633,7 @@
         <w:pStyle w:val="ListParagraph"/>
         <w:numPr>
           <w:ilvl w:val="0"/>
-          <w:numId w:val="11"/>
+          <w:numId w:val="12"/>
         </w:numPr>
         <w:spacing w:after="70" w:line="290"/>
         <w:jc w:val="both"/>
@@ -17672,7 +18662,7 @@
         <w:pStyle w:val="ListParagraph"/>
         <w:numPr>
           <w:ilvl w:val="0"/>
-          <w:numId w:val="11"/>
+          <w:numId w:val="12"/>
         </w:numPr>
         <w:spacing w:after="70" w:line="290"/>
         <w:jc w:val="both"/>
@@ -21873,7 +22863,7 @@
         <w:pStyle w:val="ListParagraph"/>
         <w:numPr>
           <w:ilvl w:val="0"/>
-          <w:numId w:val="12"/>
+          <w:numId w:val="13"/>
         </w:numPr>
         <w:spacing w:after="70" w:line="290"/>
         <w:jc w:val="both"/>
@@ -21903,315 +22893,6 @@
           <w:szCs w:val="24"/>
         </w:rPr>
         <w:t xml:space="preserve">, tạo bản ghi tbl_knowledge_documents trạng thái QUEUED và đẩy job Hangfire. Job cấp một link đọc SAS (hết hạn sau 60 phút) và gọi RAG.</w:t>
-      </w:r>
-    </w:p>
-    <w:p>
-      <w:pPr>
-        <w:pStyle w:val="ListParagraph"/>
-        <w:numPr>
-          <w:ilvl w:val="0"/>
-          <w:numId w:val="12"/>
-        </w:numPr>
-        <w:spacing w:after="70" w:line="290"/>
-        <w:jc w:val="both"/>
-      </w:pPr>
-      <w:r>
-        <w:rPr>
-          <w:rFonts w:ascii="Times New Roman" w:cs="Times New Roman" w:eastAsia="Times New Roman" w:hAnsi="Times New Roman"/>
-          <w:sz w:val="24"/>
-          <w:szCs w:val="24"/>
-        </w:rPr>
-        <w:t xml:space="preserve">RAG tải file và </w:t>
-      </w:r>
-      <w:r>
-        <w:rPr>
-          <w:rFonts w:ascii="Times New Roman" w:cs="Times New Roman" w:eastAsia="Times New Roman" w:hAnsi="Times New Roman"/>
-          <w:b/>
-          <w:bCs/>
-          <w:sz w:val="24"/>
-          <w:szCs w:val="24"/>
-        </w:rPr>
-        <w:t xml:space="preserve">trích văn bản</w:t>
-      </w:r>
-      <w:r>
-        <w:rPr>
-          <w:rFonts w:ascii="Times New Roman" w:cs="Times New Roman" w:eastAsia="Times New Roman" w:hAnsi="Times New Roman"/>
-          <w:sz w:val="24"/>
-          <w:szCs w:val="24"/>
-        </w:rPr>
-        <w:t xml:space="preserve"> theo định dạng: PDF (pdfplumber), DOCX (python-docx), TXT, JSON và JSONL, Excel. Không có OCR nên PDF chụp ảnh không đọc được.</w:t>
-      </w:r>
-    </w:p>
-    <w:p>
-      <w:pPr>
-        <w:pStyle w:val="ListParagraph"/>
-        <w:numPr>
-          <w:ilvl w:val="0"/>
-          <w:numId w:val="12"/>
-        </w:numPr>
-        <w:spacing w:after="70" w:line="290"/>
-        <w:jc w:val="both"/>
-      </w:pPr>
-      <w:r>
-        <w:rPr>
-          <w:rFonts w:ascii="Times New Roman" w:cs="Times New Roman" w:eastAsia="Times New Roman" w:hAnsi="Times New Roman"/>
-          <w:sz w:val="24"/>
-          <w:szCs w:val="24"/>
-        </w:rPr>
-        <w:t xml:space="preserve">Nếu là phạm vi </w:t>
-      </w:r>
-      <w:r>
-        <w:rPr>
-          <w:rFonts w:ascii="Times New Roman" w:cs="Times New Roman" w:eastAsia="Times New Roman" w:hAnsi="Times New Roman"/>
-          <w:b/>
-          <w:bCs/>
-          <w:sz w:val="24"/>
-          <w:szCs w:val="24"/>
-        </w:rPr>
-        <w:t xml:space="preserve">HR</w:t>
-      </w:r>
-      <w:r>
-        <w:rPr>
-          <w:rFonts w:ascii="Times New Roman" w:cs="Times New Roman" w:eastAsia="Times New Roman" w:hAnsi="Times New Roman"/>
-          <w:sz w:val="24"/>
-          <w:szCs w:val="24"/>
-        </w:rPr>
-        <w:t xml:space="preserve"> thì </w:t>
-      </w:r>
-      <w:r>
-        <w:rPr>
-          <w:rFonts w:ascii="Times New Roman" w:cs="Times New Roman" w:eastAsia="Times New Roman" w:hAnsi="Times New Roman"/>
-          <w:b/>
-          <w:bCs/>
-          <w:sz w:val="24"/>
-          <w:szCs w:val="24"/>
-        </w:rPr>
-        <w:t xml:space="preserve">kiểm tra JD</w:t>
-      </w:r>
-      <w:r>
-        <w:rPr>
-          <w:rFonts w:ascii="Times New Roman" w:cs="Times New Roman" w:eastAsia="Times New Roman" w:hAnsi="Times New Roman"/>
-          <w:sz w:val="24"/>
-          <w:szCs w:val="24"/>
-        </w:rPr>
-        <w:t xml:space="preserve"> (đủ độ dài khoảng 400 ký tự và 80 đến 100 từ, tỷ lệ ký tự in được, tỷ lệ dòng trùng, có ít nhất 2 trong 4 nhóm tín hiệu). Không đạt thì tài liệu Failed kèm lý do.</w:t>
-      </w:r>
-    </w:p>
-    <w:p>
-      <w:pPr>
-        <w:pStyle w:val="ListParagraph"/>
-        <w:numPr>
-          <w:ilvl w:val="0"/>
-          <w:numId w:val="12"/>
-        </w:numPr>
-        <w:spacing w:after="70" w:line="290"/>
-        <w:jc w:val="both"/>
-      </w:pPr>
-      <w:r>
-        <w:rPr>
-          <w:rFonts w:ascii="Times New Roman" w:cs="Times New Roman" w:eastAsia="Times New Roman" w:hAnsi="Times New Roman"/>
-          <w:b/>
-          <w:bCs/>
-          <w:sz w:val="24"/>
-          <w:szCs w:val="24"/>
-        </w:rPr>
-        <w:t xml:space="preserve">Xoá bản cũ</w:t>
-      </w:r>
-      <w:r>
-        <w:rPr>
-          <w:rFonts w:ascii="Times New Roman" w:cs="Times New Roman" w:eastAsia="Times New Roman" w:hAnsi="Times New Roman"/>
-          <w:sz w:val="24"/>
-          <w:szCs w:val="24"/>
-        </w:rPr>
-        <w:t xml:space="preserve"> cùng tên file của cùng chủ sở hữu (để nạp lại không bị trùng), rồi </w:t>
-      </w:r>
-      <w:r>
-        <w:rPr>
-          <w:rFonts w:ascii="Times New Roman" w:cs="Times New Roman" w:eastAsia="Times New Roman" w:hAnsi="Times New Roman"/>
-          <w:b/>
-          <w:bCs/>
-          <w:sz w:val="24"/>
-          <w:szCs w:val="24"/>
-        </w:rPr>
-        <w:t xml:space="preserve">chia đoạn</w:t>
-      </w:r>
-      <w:r>
-        <w:rPr>
-          <w:rFonts w:ascii="Times New Roman" w:cs="Times New Roman" w:eastAsia="Times New Roman" w:hAnsi="Times New Roman"/>
-          <w:sz w:val="24"/>
-          <w:szCs w:val="24"/>
-        </w:rPr>
-        <w:t xml:space="preserve"> bằng thuật toán đệ quy: thử chia theo đoạn văn, rồi theo dòng, rồi theo câu, rồi theo khoảng trắng, cuối cùng cắt cứng. </w:t>
-      </w:r>
-      <w:r>
-        <w:rPr>
-          <w:rFonts w:ascii="Times New Roman" w:cs="Times New Roman" w:eastAsia="Times New Roman" w:hAnsi="Times New Roman"/>
-          <w:b/>
-          <w:bCs/>
-          <w:sz w:val="24"/>
-          <w:szCs w:val="24"/>
-        </w:rPr>
-        <w:t xml:space="preserve">Kích thước mỗi đoạn 1200 ký tự, chồng lấn 200 ký tự</w:t>
-      </w:r>
-      <w:r>
-        <w:rPr>
-          <w:rFonts w:ascii="Times New Roman" w:cs="Times New Roman" w:eastAsia="Times New Roman" w:hAnsi="Times New Roman"/>
-          <w:sz w:val="24"/>
-          <w:szCs w:val="24"/>
-        </w:rPr>
-        <w:t xml:space="preserve"> (cài đặt CHUNK_SIZE và CHUNK_OVERLAP).</w:t>
-      </w:r>
-    </w:p>
-    <w:p>
-      <w:pPr>
-        <w:pStyle w:val="ListParagraph"/>
-        <w:numPr>
-          <w:ilvl w:val="0"/>
-          <w:numId w:val="12"/>
-        </w:numPr>
-        <w:spacing w:after="70" w:line="290"/>
-        <w:jc w:val="both"/>
-      </w:pPr>
-      <w:r>
-        <w:rPr>
-          <w:rFonts w:ascii="Times New Roman" w:cs="Times New Roman" w:eastAsia="Times New Roman" w:hAnsi="Times New Roman"/>
-          <w:sz w:val="24"/>
-          <w:szCs w:val="24"/>
-        </w:rPr>
-        <w:t xml:space="preserve">Mỗi đoạn được </w:t>
-      </w:r>
-      <w:r>
-        <w:rPr>
-          <w:rFonts w:ascii="Times New Roman" w:cs="Times New Roman" w:eastAsia="Times New Roman" w:hAnsi="Times New Roman"/>
-          <w:b/>
-          <w:bCs/>
-          <w:sz w:val="24"/>
-          <w:szCs w:val="24"/>
-        </w:rPr>
-        <w:t xml:space="preserve">embedding</w:t>
-      </w:r>
-      <w:r>
-        <w:rPr>
-          <w:rFonts w:ascii="Times New Roman" w:cs="Times New Roman" w:eastAsia="Times New Roman" w:hAnsi="Times New Roman"/>
-          <w:sz w:val="24"/>
-          <w:szCs w:val="24"/>
-        </w:rPr>
-        <w:t xml:space="preserve"> bằng mô hình nomic-embed-text ra vector </w:t>
-      </w:r>
-      <w:r>
-        <w:rPr>
-          <w:rFonts w:ascii="Times New Roman" w:cs="Times New Roman" w:eastAsia="Times New Roman" w:hAnsi="Times New Roman"/>
-          <w:b/>
-          <w:bCs/>
-          <w:sz w:val="24"/>
-          <w:szCs w:val="24"/>
-        </w:rPr>
-        <w:t xml:space="preserve">768 chiều</w:t>
-      </w:r>
-      <w:r>
-        <w:rPr>
-          <w:rFonts w:ascii="Times New Roman" w:cs="Times New Roman" w:eastAsia="Times New Roman" w:hAnsi="Times New Roman"/>
-          <w:sz w:val="24"/>
-          <w:szCs w:val="24"/>
-        </w:rPr>
-        <w:t xml:space="preserve">, kèm metadata: tên file, số thứ tự đoạn, loại tài liệu (suy ra từ tên file), phạm vi và chủ sở hữu.</w:t>
-      </w:r>
-    </w:p>
-    <w:p>
-      <w:pPr>
-        <w:pStyle w:val="ListParagraph"/>
-        <w:numPr>
-          <w:ilvl w:val="0"/>
-          <w:numId w:val="12"/>
-        </w:numPr>
-        <w:spacing w:after="70" w:line="290"/>
-        <w:jc w:val="both"/>
-      </w:pPr>
-      <w:r>
-        <w:rPr>
-          <w:rFonts w:ascii="Times New Roman" w:cs="Times New Roman" w:eastAsia="Times New Roman" w:hAnsi="Times New Roman"/>
-          <w:sz w:val="24"/>
-          <w:szCs w:val="24"/>
-        </w:rPr>
-        <w:t xml:space="preserve">Lưu vào kho vector (bản chạy thật: bảng tbl_knowledge_chunks trong PostgreSQL; bản cũ trên máy: ChromaDB với hai collection system_kb và hr_kb). RAG </w:t>
-      </w:r>
-      <w:r>
-        <w:rPr>
-          <w:rFonts w:ascii="Times New Roman" w:cs="Times New Roman" w:eastAsia="Times New Roman" w:hAnsi="Times New Roman"/>
-          <w:b/>
-          <w:bCs/>
-          <w:sz w:val="24"/>
-          <w:szCs w:val="24"/>
-        </w:rPr>
-        <w:t xml:space="preserve">callback</w:t>
-      </w:r>
-      <w:r>
-        <w:rPr>
-          <w:rFonts w:ascii="Times New Roman" w:cs="Times New Roman" w:eastAsia="Times New Roman" w:hAnsi="Times New Roman"/>
-          <w:sz w:val="24"/>
-          <w:szCs w:val="24"/>
-        </w:rPr>
-        <w:t xml:space="preserve"> COMPLETED kèm ChunkCount, hoặc FAILED kèm lỗi.</w:t>
-      </w:r>
-    </w:p>
-    <w:p>
-      <w:pPr>
-        <w:spacing w:after="120" w:line="300"/>
-        <w:jc w:val="both"/>
-      </w:pPr>
-      <w:r>
-        <w:rPr>
-          <w:rFonts w:ascii="Times New Roman" w:cs="Times New Roman" w:eastAsia="Times New Roman" w:hAnsi="Times New Roman"/>
-          <w:b/>
-          <w:bCs/>
-          <w:sz w:val="24"/>
-          <w:szCs w:val="24"/>
-        </w:rPr>
-        <w:t xml:space="preserve">Vì sao chồng lấn 200 ký tự?</w:t>
-      </w:r>
-      <w:r>
-        <w:rPr>
-          <w:rFonts w:ascii="Times New Roman" w:cs="Times New Roman" w:eastAsia="Times New Roman" w:hAnsi="Times New Roman"/>
-          <w:sz w:val="24"/>
-          <w:szCs w:val="24"/>
-        </w:rPr>
-        <w:t xml:space="preserve"> Để một ý nằm sát ranh giới hai đoạn không bị cắt mất ngữ cảnh. </w:t>
-      </w:r>
-      <w:r>
-        <w:rPr>
-          <w:rFonts w:ascii="Times New Roman" w:cs="Times New Roman" w:eastAsia="Times New Roman" w:hAnsi="Times New Roman"/>
-          <w:b/>
-          <w:bCs/>
-          <w:sz w:val="24"/>
-          <w:szCs w:val="24"/>
-        </w:rPr>
-        <w:t xml:space="preserve">Vì sao 1200?</w:t>
-      </w:r>
-      <w:r>
-        <w:rPr>
-          <w:rFonts w:ascii="Times New Roman" w:cs="Times New Roman" w:eastAsia="Times New Roman" w:hAnsi="Times New Roman"/>
-          <w:sz w:val="24"/>
-          <w:szCs w:val="24"/>
-        </w:rPr>
-        <w:t xml:space="preserve"> Đủ dài để giữ trọn một ý kỹ thuật, đủ ngắn để nhiều đoạn cùng vừa trong prompt.</w:t>
-      </w:r>
-    </w:p>
-    <w:p>
-      <w:pPr>
-        <w:pStyle w:val="Heading3"/>
-        <w:keepNext/>
-        <w:spacing w:after="80" w:before="160"/>
-      </w:pPr>
-      <w:r>
-        <w:rPr>
-          <w:rFonts w:ascii="Times New Roman" w:cs="Times New Roman" w:eastAsia="Times New Roman" w:hAnsi="Times New Roman"/>
-          <w:b/>
-          <w:bCs/>
-          <w:color w:val="000000"/>
-          <w:sz w:val="25"/>
-          <w:szCs w:val="25"/>
-        </w:rPr>
-        <w:t xml:space="preserve">A.4.4. Truy xuất (retrieval): chọn đoạn nào đưa cho mô hình</w:t>
       </w:r>
     </w:p>
     <w:p>
@@ -22230,25 +22911,25 @@
           <w:sz w:val="24"/>
           <w:szCs w:val="24"/>
         </w:rPr>
-        <w:t xml:space="preserve">Ghép </w:t>
-      </w:r>
-      <w:r>
-        <w:rPr>
-          <w:rFonts w:ascii="Times New Roman" w:cs="Times New Roman" w:eastAsia="Times New Roman" w:hAnsi="Times New Roman"/>
-          <w:b/>
-          <w:bCs/>
-          <w:sz w:val="24"/>
-          <w:szCs w:val="24"/>
-        </w:rPr>
-        <w:t xml:space="preserve">câu truy vấn</w:t>
-      </w:r>
-      <w:r>
-        <w:rPr>
-          <w:rFonts w:ascii="Times New Roman" w:cs="Times New Roman" w:eastAsia="Times New Roman" w:hAnsi="Times New Roman"/>
-          <w:sz w:val="24"/>
-          <w:szCs w:val="24"/>
-        </w:rPr>
-        <w:t xml:space="preserve"> từ cấp độ, vị trí, loại câu hỏi và chủ đề ưu tiên (ví dụ "senior backend developer interview questions rubric technical ...").</w:t>
+        <w:t xml:space="preserve">RAG tải file và </w:t>
+      </w:r>
+      <w:r>
+        <w:rPr>
+          <w:rFonts w:ascii="Times New Roman" w:cs="Times New Roman" w:eastAsia="Times New Roman" w:hAnsi="Times New Roman"/>
+          <w:b/>
+          <w:bCs/>
+          <w:sz w:val="24"/>
+          <w:szCs w:val="24"/>
+        </w:rPr>
+        <w:t xml:space="preserve">trích văn bản</w:t>
+      </w:r>
+      <w:r>
+        <w:rPr>
+          <w:rFonts w:ascii="Times New Roman" w:cs="Times New Roman" w:eastAsia="Times New Roman" w:hAnsi="Times New Roman"/>
+          <w:sz w:val="24"/>
+          <w:szCs w:val="24"/>
+        </w:rPr>
+        <w:t xml:space="preserve"> theo định dạng: PDF (pdfplumber), DOCX (python-docx), TXT, JSON và JSONL, Excel. Không có OCR nên PDF chụp ảnh không đọc được.</w:t>
       </w:r>
     </w:p>
     <w:p>
@@ -22264,38 +22945,46 @@
       <w:r>
         <w:rPr>
           <w:rFonts w:ascii="Times New Roman" w:cs="Times New Roman" w:eastAsia="Times New Roman" w:hAnsi="Times New Roman"/>
-          <w:b/>
-          <w:bCs/>
-          <w:sz w:val="24"/>
-          <w:szCs w:val="24"/>
-        </w:rPr>
-        <w:t xml:space="preserve">Embedding câu truy vấn</w:t>
-      </w:r>
-      <w:r>
-        <w:rPr>
-          <w:rFonts w:ascii="Times New Roman" w:cs="Times New Roman" w:eastAsia="Times New Roman" w:hAnsi="Times New Roman"/>
-          <w:sz w:val="24"/>
-          <w:szCs w:val="24"/>
-        </w:rPr>
-        <w:t xml:space="preserve"> bằng cùng mô hình, rồi tìm theo </w:t>
-      </w:r>
-      <w:r>
-        <w:rPr>
-          <w:rFonts w:ascii="Times New Roman" w:cs="Times New Roman" w:eastAsia="Times New Roman" w:hAnsi="Times New Roman"/>
-          <w:b/>
-          <w:bCs/>
-          <w:sz w:val="24"/>
-          <w:szCs w:val="24"/>
-        </w:rPr>
-        <w:t xml:space="preserve">độ tương đồng cosine</w:t>
-      </w:r>
-      <w:r>
-        <w:rPr>
-          <w:rFonts w:ascii="Times New Roman" w:cs="Times New Roman" w:eastAsia="Times New Roman" w:hAnsi="Times New Roman"/>
-          <w:sz w:val="24"/>
-          <w:szCs w:val="24"/>
-        </w:rPr>
-        <w:t xml:space="preserve"> (điểm bằng 1 trừ khoảng cách).</w:t>
+          <w:sz w:val="24"/>
+          <w:szCs w:val="24"/>
+        </w:rPr>
+        <w:t xml:space="preserve">Nếu là phạm vi </w:t>
+      </w:r>
+      <w:r>
+        <w:rPr>
+          <w:rFonts w:ascii="Times New Roman" w:cs="Times New Roman" w:eastAsia="Times New Roman" w:hAnsi="Times New Roman"/>
+          <w:b/>
+          <w:bCs/>
+          <w:sz w:val="24"/>
+          <w:szCs w:val="24"/>
+        </w:rPr>
+        <w:t xml:space="preserve">HR</w:t>
+      </w:r>
+      <w:r>
+        <w:rPr>
+          <w:rFonts w:ascii="Times New Roman" w:cs="Times New Roman" w:eastAsia="Times New Roman" w:hAnsi="Times New Roman"/>
+          <w:sz w:val="24"/>
+          <w:szCs w:val="24"/>
+        </w:rPr>
+        <w:t xml:space="preserve"> thì </w:t>
+      </w:r>
+      <w:r>
+        <w:rPr>
+          <w:rFonts w:ascii="Times New Roman" w:cs="Times New Roman" w:eastAsia="Times New Roman" w:hAnsi="Times New Roman"/>
+          <w:b/>
+          <w:bCs/>
+          <w:sz w:val="24"/>
+          <w:szCs w:val="24"/>
+        </w:rPr>
+        <w:t xml:space="preserve">kiểm tra JD</w:t>
+      </w:r>
+      <w:r>
+        <w:rPr>
+          <w:rFonts w:ascii="Times New Roman" w:cs="Times New Roman" w:eastAsia="Times New Roman" w:hAnsi="Times New Roman"/>
+          <w:sz w:val="24"/>
+          <w:szCs w:val="24"/>
+        </w:rPr>
+        <w:t xml:space="preserve"> (đủ độ dài khoảng 400 ký tự và 80 đến 100 từ, tỷ lệ ký tự in được, tỷ lệ dòng trùng, có ít nhất 2 trong 4 nhóm tín hiệu). Không đạt thì tài liệu Failed kèm lý do.</w:t>
       </w:r>
     </w:p>
     <w:p>
@@ -22311,64 +23000,56 @@
       <w:r>
         <w:rPr>
           <w:rFonts w:ascii="Times New Roman" w:cs="Times New Roman" w:eastAsia="Times New Roman" w:hAnsi="Times New Roman"/>
-          <w:sz w:val="24"/>
-          <w:szCs w:val="24"/>
-        </w:rPr>
-        <w:t xml:space="preserve">Lấy tối đa </w:t>
-      </w:r>
-      <w:r>
-        <w:rPr>
-          <w:rFonts w:ascii="Times New Roman" w:cs="Times New Roman" w:eastAsia="Times New Roman" w:hAnsi="Times New Roman"/>
-          <w:b/>
-          <w:bCs/>
-          <w:sz w:val="24"/>
-          <w:szCs w:val="24"/>
-        </w:rPr>
-        <w:t xml:space="preserve">5 đoạn từ kho SYSTEM</w:t>
-      </w:r>
-      <w:r>
-        <w:rPr>
-          <w:rFonts w:ascii="Times New Roman" w:cs="Times New Roman" w:eastAsia="Times New Roman" w:hAnsi="Times New Roman"/>
-          <w:sz w:val="24"/>
-          <w:szCs w:val="24"/>
-        </w:rPr>
-        <w:t xml:space="preserve"> và </w:t>
-      </w:r>
-      <w:r>
-        <w:rPr>
-          <w:rFonts w:ascii="Times New Roman" w:cs="Times New Roman" w:eastAsia="Times New Roman" w:hAnsi="Times New Roman"/>
-          <w:b/>
-          <w:bCs/>
-          <w:sz w:val="24"/>
-          <w:szCs w:val="24"/>
-        </w:rPr>
-        <w:t xml:space="preserve">5 đoạn từ tài liệu của HR</w:t>
-      </w:r>
-      <w:r>
-        <w:rPr>
-          <w:rFonts w:ascii="Times New Roman" w:cs="Times New Roman" w:eastAsia="Times New Roman" w:hAnsi="Times New Roman"/>
-          <w:sz w:val="24"/>
-          <w:szCs w:val="24"/>
-        </w:rPr>
-        <w:t xml:space="preserve"> (TOP_K_SYSTEM và TOP_K_HR), </w:t>
-      </w:r>
-      <w:r>
-        <w:rPr>
-          <w:rFonts w:ascii="Times New Roman" w:cs="Times New Roman" w:eastAsia="Times New Roman" w:hAnsi="Times New Roman"/>
-          <w:b/>
-          <w:bCs/>
-          <w:sz w:val="24"/>
-          <w:szCs w:val="24"/>
-        </w:rPr>
-        <w:t xml:space="preserve">bỏ những đoạn có điểm dưới 0,3</w:t>
-      </w:r>
-      <w:r>
-        <w:rPr>
-          <w:rFonts w:ascii="Times New Roman" w:cs="Times New Roman" w:eastAsia="Times New Roman" w:hAnsi="Times New Roman"/>
-          <w:sz w:val="24"/>
-          <w:szCs w:val="24"/>
-        </w:rPr>
-        <w:t xml:space="preserve"> (MIN_SCORE).</w:t>
+          <w:b/>
+          <w:bCs/>
+          <w:sz w:val="24"/>
+          <w:szCs w:val="24"/>
+        </w:rPr>
+        <w:t xml:space="preserve">Xoá bản cũ</w:t>
+      </w:r>
+      <w:r>
+        <w:rPr>
+          <w:rFonts w:ascii="Times New Roman" w:cs="Times New Roman" w:eastAsia="Times New Roman" w:hAnsi="Times New Roman"/>
+          <w:sz w:val="24"/>
+          <w:szCs w:val="24"/>
+        </w:rPr>
+        <w:t xml:space="preserve"> cùng tên file của cùng chủ sở hữu (để nạp lại không bị trùng), rồi </w:t>
+      </w:r>
+      <w:r>
+        <w:rPr>
+          <w:rFonts w:ascii="Times New Roman" w:cs="Times New Roman" w:eastAsia="Times New Roman" w:hAnsi="Times New Roman"/>
+          <w:b/>
+          <w:bCs/>
+          <w:sz w:val="24"/>
+          <w:szCs w:val="24"/>
+        </w:rPr>
+        <w:t xml:space="preserve">chia đoạn</w:t>
+      </w:r>
+      <w:r>
+        <w:rPr>
+          <w:rFonts w:ascii="Times New Roman" w:cs="Times New Roman" w:eastAsia="Times New Roman" w:hAnsi="Times New Roman"/>
+          <w:sz w:val="24"/>
+          <w:szCs w:val="24"/>
+        </w:rPr>
+        <w:t xml:space="preserve"> bằng thuật toán đệ quy: thử chia theo đoạn văn, rồi theo dòng, rồi theo câu, rồi theo khoảng trắng, cuối cùng cắt cứng. </w:t>
+      </w:r>
+      <w:r>
+        <w:rPr>
+          <w:rFonts w:ascii="Times New Roman" w:cs="Times New Roman" w:eastAsia="Times New Roman" w:hAnsi="Times New Roman"/>
+          <w:b/>
+          <w:bCs/>
+          <w:sz w:val="24"/>
+          <w:szCs w:val="24"/>
+        </w:rPr>
+        <w:t xml:space="preserve">Kích thước mỗi đoạn 1200 ký tự, chồng lấn 200 ký tự</w:t>
+      </w:r>
+      <w:r>
+        <w:rPr>
+          <w:rFonts w:ascii="Times New Roman" w:cs="Times New Roman" w:eastAsia="Times New Roman" w:hAnsi="Times New Roman"/>
+          <w:sz w:val="24"/>
+          <w:szCs w:val="24"/>
+        </w:rPr>
+        <w:t xml:space="preserve"> (cài đặt CHUNK_SIZE và CHUNK_OVERLAP).</w:t>
       </w:r>
     </w:p>
     <w:p>
@@ -22377,6 +23058,315 @@
         <w:numPr>
           <w:ilvl w:val="0"/>
           <w:numId w:val="13"/>
+        </w:numPr>
+        <w:spacing w:after="70" w:line="290"/>
+        <w:jc w:val="both"/>
+      </w:pPr>
+      <w:r>
+        <w:rPr>
+          <w:rFonts w:ascii="Times New Roman" w:cs="Times New Roman" w:eastAsia="Times New Roman" w:hAnsi="Times New Roman"/>
+          <w:sz w:val="24"/>
+          <w:szCs w:val="24"/>
+        </w:rPr>
+        <w:t xml:space="preserve">Mỗi đoạn được </w:t>
+      </w:r>
+      <w:r>
+        <w:rPr>
+          <w:rFonts w:ascii="Times New Roman" w:cs="Times New Roman" w:eastAsia="Times New Roman" w:hAnsi="Times New Roman"/>
+          <w:b/>
+          <w:bCs/>
+          <w:sz w:val="24"/>
+          <w:szCs w:val="24"/>
+        </w:rPr>
+        <w:t xml:space="preserve">embedding</w:t>
+      </w:r>
+      <w:r>
+        <w:rPr>
+          <w:rFonts w:ascii="Times New Roman" w:cs="Times New Roman" w:eastAsia="Times New Roman" w:hAnsi="Times New Roman"/>
+          <w:sz w:val="24"/>
+          <w:szCs w:val="24"/>
+        </w:rPr>
+        <w:t xml:space="preserve"> bằng mô hình nomic-embed-text ra vector </w:t>
+      </w:r>
+      <w:r>
+        <w:rPr>
+          <w:rFonts w:ascii="Times New Roman" w:cs="Times New Roman" w:eastAsia="Times New Roman" w:hAnsi="Times New Roman"/>
+          <w:b/>
+          <w:bCs/>
+          <w:sz w:val="24"/>
+          <w:szCs w:val="24"/>
+        </w:rPr>
+        <w:t xml:space="preserve">768 chiều</w:t>
+      </w:r>
+      <w:r>
+        <w:rPr>
+          <w:rFonts w:ascii="Times New Roman" w:cs="Times New Roman" w:eastAsia="Times New Roman" w:hAnsi="Times New Roman"/>
+          <w:sz w:val="24"/>
+          <w:szCs w:val="24"/>
+        </w:rPr>
+        <w:t xml:space="preserve">, kèm metadata: tên file, số thứ tự đoạn, loại tài liệu (suy ra từ tên file), phạm vi và chủ sở hữu.</w:t>
+      </w:r>
+    </w:p>
+    <w:p>
+      <w:pPr>
+        <w:pStyle w:val="ListParagraph"/>
+        <w:numPr>
+          <w:ilvl w:val="0"/>
+          <w:numId w:val="13"/>
+        </w:numPr>
+        <w:spacing w:after="70" w:line="290"/>
+        <w:jc w:val="both"/>
+      </w:pPr>
+      <w:r>
+        <w:rPr>
+          <w:rFonts w:ascii="Times New Roman" w:cs="Times New Roman" w:eastAsia="Times New Roman" w:hAnsi="Times New Roman"/>
+          <w:sz w:val="24"/>
+          <w:szCs w:val="24"/>
+        </w:rPr>
+        <w:t xml:space="preserve">Lưu vào kho vector (bản chạy thật: bảng tbl_knowledge_chunks trong PostgreSQL; bản cũ trên máy: ChromaDB với hai collection system_kb và hr_kb). RAG </w:t>
+      </w:r>
+      <w:r>
+        <w:rPr>
+          <w:rFonts w:ascii="Times New Roman" w:cs="Times New Roman" w:eastAsia="Times New Roman" w:hAnsi="Times New Roman"/>
+          <w:b/>
+          <w:bCs/>
+          <w:sz w:val="24"/>
+          <w:szCs w:val="24"/>
+        </w:rPr>
+        <w:t xml:space="preserve">callback</w:t>
+      </w:r>
+      <w:r>
+        <w:rPr>
+          <w:rFonts w:ascii="Times New Roman" w:cs="Times New Roman" w:eastAsia="Times New Roman" w:hAnsi="Times New Roman"/>
+          <w:sz w:val="24"/>
+          <w:szCs w:val="24"/>
+        </w:rPr>
+        <w:t xml:space="preserve"> COMPLETED kèm ChunkCount, hoặc FAILED kèm lỗi.</w:t>
+      </w:r>
+    </w:p>
+    <w:p>
+      <w:pPr>
+        <w:spacing w:after="120" w:line="300"/>
+        <w:jc w:val="both"/>
+      </w:pPr>
+      <w:r>
+        <w:rPr>
+          <w:rFonts w:ascii="Times New Roman" w:cs="Times New Roman" w:eastAsia="Times New Roman" w:hAnsi="Times New Roman"/>
+          <w:b/>
+          <w:bCs/>
+          <w:sz w:val="24"/>
+          <w:szCs w:val="24"/>
+        </w:rPr>
+        <w:t xml:space="preserve">Vì sao chồng lấn 200 ký tự?</w:t>
+      </w:r>
+      <w:r>
+        <w:rPr>
+          <w:rFonts w:ascii="Times New Roman" w:cs="Times New Roman" w:eastAsia="Times New Roman" w:hAnsi="Times New Roman"/>
+          <w:sz w:val="24"/>
+          <w:szCs w:val="24"/>
+        </w:rPr>
+        <w:t xml:space="preserve"> Để một ý nằm sát ranh giới hai đoạn không bị cắt mất ngữ cảnh. </w:t>
+      </w:r>
+      <w:r>
+        <w:rPr>
+          <w:rFonts w:ascii="Times New Roman" w:cs="Times New Roman" w:eastAsia="Times New Roman" w:hAnsi="Times New Roman"/>
+          <w:b/>
+          <w:bCs/>
+          <w:sz w:val="24"/>
+          <w:szCs w:val="24"/>
+        </w:rPr>
+        <w:t xml:space="preserve">Vì sao 1200?</w:t>
+      </w:r>
+      <w:r>
+        <w:rPr>
+          <w:rFonts w:ascii="Times New Roman" w:cs="Times New Roman" w:eastAsia="Times New Roman" w:hAnsi="Times New Roman"/>
+          <w:sz w:val="24"/>
+          <w:szCs w:val="24"/>
+        </w:rPr>
+        <w:t xml:space="preserve"> Đủ dài để giữ trọn một ý kỹ thuật, đủ ngắn để nhiều đoạn cùng vừa trong prompt.</w:t>
+      </w:r>
+    </w:p>
+    <w:p>
+      <w:pPr>
+        <w:pStyle w:val="Heading3"/>
+        <w:keepNext/>
+        <w:spacing w:after="80" w:before="160"/>
+      </w:pPr>
+      <w:r>
+        <w:rPr>
+          <w:rFonts w:ascii="Times New Roman" w:cs="Times New Roman" w:eastAsia="Times New Roman" w:hAnsi="Times New Roman"/>
+          <w:b/>
+          <w:bCs/>
+          <w:color w:val="000000"/>
+          <w:sz w:val="25"/>
+          <w:szCs w:val="25"/>
+        </w:rPr>
+        <w:t xml:space="preserve">A.4.4. Truy xuất (retrieval): chọn đoạn nào đưa cho mô hình</w:t>
+      </w:r>
+    </w:p>
+    <w:p>
+      <w:pPr>
+        <w:pStyle w:val="ListParagraph"/>
+        <w:numPr>
+          <w:ilvl w:val="0"/>
+          <w:numId w:val="14"/>
+        </w:numPr>
+        <w:spacing w:after="70" w:line="290"/>
+        <w:jc w:val="both"/>
+      </w:pPr>
+      <w:r>
+        <w:rPr>
+          <w:rFonts w:ascii="Times New Roman" w:cs="Times New Roman" w:eastAsia="Times New Roman" w:hAnsi="Times New Roman"/>
+          <w:sz w:val="24"/>
+          <w:szCs w:val="24"/>
+        </w:rPr>
+        <w:t xml:space="preserve">Ghép </w:t>
+      </w:r>
+      <w:r>
+        <w:rPr>
+          <w:rFonts w:ascii="Times New Roman" w:cs="Times New Roman" w:eastAsia="Times New Roman" w:hAnsi="Times New Roman"/>
+          <w:b/>
+          <w:bCs/>
+          <w:sz w:val="24"/>
+          <w:szCs w:val="24"/>
+        </w:rPr>
+        <w:t xml:space="preserve">câu truy vấn</w:t>
+      </w:r>
+      <w:r>
+        <w:rPr>
+          <w:rFonts w:ascii="Times New Roman" w:cs="Times New Roman" w:eastAsia="Times New Roman" w:hAnsi="Times New Roman"/>
+          <w:sz w:val="24"/>
+          <w:szCs w:val="24"/>
+        </w:rPr>
+        <w:t xml:space="preserve"> từ cấp độ, vị trí, loại câu hỏi và chủ đề ưu tiên (ví dụ "senior backend developer interview questions rubric technical ...").</w:t>
+      </w:r>
+    </w:p>
+    <w:p>
+      <w:pPr>
+        <w:pStyle w:val="ListParagraph"/>
+        <w:numPr>
+          <w:ilvl w:val="0"/>
+          <w:numId w:val="14"/>
+        </w:numPr>
+        <w:spacing w:after="70" w:line="290"/>
+        <w:jc w:val="both"/>
+      </w:pPr>
+      <w:r>
+        <w:rPr>
+          <w:rFonts w:ascii="Times New Roman" w:cs="Times New Roman" w:eastAsia="Times New Roman" w:hAnsi="Times New Roman"/>
+          <w:b/>
+          <w:bCs/>
+          <w:sz w:val="24"/>
+          <w:szCs w:val="24"/>
+        </w:rPr>
+        <w:t xml:space="preserve">Embedding câu truy vấn</w:t>
+      </w:r>
+      <w:r>
+        <w:rPr>
+          <w:rFonts w:ascii="Times New Roman" w:cs="Times New Roman" w:eastAsia="Times New Roman" w:hAnsi="Times New Roman"/>
+          <w:sz w:val="24"/>
+          <w:szCs w:val="24"/>
+        </w:rPr>
+        <w:t xml:space="preserve"> bằng cùng mô hình, rồi tìm theo </w:t>
+      </w:r>
+      <w:r>
+        <w:rPr>
+          <w:rFonts w:ascii="Times New Roman" w:cs="Times New Roman" w:eastAsia="Times New Roman" w:hAnsi="Times New Roman"/>
+          <w:b/>
+          <w:bCs/>
+          <w:sz w:val="24"/>
+          <w:szCs w:val="24"/>
+        </w:rPr>
+        <w:t xml:space="preserve">độ tương đồng cosine</w:t>
+      </w:r>
+      <w:r>
+        <w:rPr>
+          <w:rFonts w:ascii="Times New Roman" w:cs="Times New Roman" w:eastAsia="Times New Roman" w:hAnsi="Times New Roman"/>
+          <w:sz w:val="24"/>
+          <w:szCs w:val="24"/>
+        </w:rPr>
+        <w:t xml:space="preserve"> (điểm bằng 1 trừ khoảng cách).</w:t>
+      </w:r>
+    </w:p>
+    <w:p>
+      <w:pPr>
+        <w:pStyle w:val="ListParagraph"/>
+        <w:numPr>
+          <w:ilvl w:val="0"/>
+          <w:numId w:val="14"/>
+        </w:numPr>
+        <w:spacing w:after="70" w:line="290"/>
+        <w:jc w:val="both"/>
+      </w:pPr>
+      <w:r>
+        <w:rPr>
+          <w:rFonts w:ascii="Times New Roman" w:cs="Times New Roman" w:eastAsia="Times New Roman" w:hAnsi="Times New Roman"/>
+          <w:sz w:val="24"/>
+          <w:szCs w:val="24"/>
+        </w:rPr>
+        <w:t xml:space="preserve">Lấy tối đa </w:t>
+      </w:r>
+      <w:r>
+        <w:rPr>
+          <w:rFonts w:ascii="Times New Roman" w:cs="Times New Roman" w:eastAsia="Times New Roman" w:hAnsi="Times New Roman"/>
+          <w:b/>
+          <w:bCs/>
+          <w:sz w:val="24"/>
+          <w:szCs w:val="24"/>
+        </w:rPr>
+        <w:t xml:space="preserve">5 đoạn từ kho SYSTEM</w:t>
+      </w:r>
+      <w:r>
+        <w:rPr>
+          <w:rFonts w:ascii="Times New Roman" w:cs="Times New Roman" w:eastAsia="Times New Roman" w:hAnsi="Times New Roman"/>
+          <w:sz w:val="24"/>
+          <w:szCs w:val="24"/>
+        </w:rPr>
+        <w:t xml:space="preserve"> và </w:t>
+      </w:r>
+      <w:r>
+        <w:rPr>
+          <w:rFonts w:ascii="Times New Roman" w:cs="Times New Roman" w:eastAsia="Times New Roman" w:hAnsi="Times New Roman"/>
+          <w:b/>
+          <w:bCs/>
+          <w:sz w:val="24"/>
+          <w:szCs w:val="24"/>
+        </w:rPr>
+        <w:t xml:space="preserve">5 đoạn từ tài liệu của HR</w:t>
+      </w:r>
+      <w:r>
+        <w:rPr>
+          <w:rFonts w:ascii="Times New Roman" w:cs="Times New Roman" w:eastAsia="Times New Roman" w:hAnsi="Times New Roman"/>
+          <w:sz w:val="24"/>
+          <w:szCs w:val="24"/>
+        </w:rPr>
+        <w:t xml:space="preserve"> (TOP_K_SYSTEM và TOP_K_HR), </w:t>
+      </w:r>
+      <w:r>
+        <w:rPr>
+          <w:rFonts w:ascii="Times New Roman" w:cs="Times New Roman" w:eastAsia="Times New Roman" w:hAnsi="Times New Roman"/>
+          <w:b/>
+          <w:bCs/>
+          <w:sz w:val="24"/>
+          <w:szCs w:val="24"/>
+        </w:rPr>
+        <w:t xml:space="preserve">bỏ những đoạn có điểm dưới 0,3</w:t>
+      </w:r>
+      <w:r>
+        <w:rPr>
+          <w:rFonts w:ascii="Times New Roman" w:cs="Times New Roman" w:eastAsia="Times New Roman" w:hAnsi="Times New Roman"/>
+          <w:sz w:val="24"/>
+          <w:szCs w:val="24"/>
+        </w:rPr>
+        <w:t xml:space="preserve"> (MIN_SCORE).</w:t>
+      </w:r>
+    </w:p>
+    <w:p>
+      <w:pPr>
+        <w:pStyle w:val="ListParagraph"/>
+        <w:numPr>
+          <w:ilvl w:val="0"/>
+          <w:numId w:val="14"/>
         </w:numPr>
         <w:spacing w:after="70" w:line="290"/>
         <w:jc w:val="both"/>
@@ -23078,7 +24068,7 @@
         <w:pStyle w:val="ListParagraph"/>
         <w:numPr>
           <w:ilvl w:val="0"/>
-          <w:numId w:val="14"/>
+          <w:numId w:val="15"/>
         </w:numPr>
         <w:spacing w:after="70" w:line="290"/>
         <w:jc w:val="both"/>
@@ -23133,7 +24123,7 @@
         <w:pStyle w:val="ListParagraph"/>
         <w:numPr>
           <w:ilvl w:val="0"/>
-          <w:numId w:val="14"/>
+          <w:numId w:val="15"/>
         </w:numPr>
         <w:spacing w:after="70" w:line="290"/>
         <w:jc w:val="both"/>
@@ -23170,7 +24160,7 @@
         <w:pStyle w:val="ListParagraph"/>
         <w:numPr>
           <w:ilvl w:val="0"/>
-          <w:numId w:val="14"/>
+          <w:numId w:val="15"/>
         </w:numPr>
         <w:spacing w:after="70" w:line="290"/>
         <w:jc w:val="both"/>
@@ -23243,7 +24233,7 @@
         <w:pStyle w:val="ListParagraph"/>
         <w:numPr>
           <w:ilvl w:val="0"/>
-          <w:numId w:val="14"/>
+          <w:numId w:val="15"/>
         </w:numPr>
         <w:spacing w:after="70" w:line="290"/>
         <w:jc w:val="both"/>
@@ -29942,7 +30932,7 @@
         <w:pStyle w:val="ListParagraph"/>
         <w:numPr>
           <w:ilvl w:val="0"/>
-          <w:numId w:val="15"/>
+          <w:numId w:val="16"/>
         </w:numPr>
         <w:spacing w:after="70" w:line="290"/>
         <w:jc w:val="both"/>
@@ -29989,7 +30979,7 @@
         <w:pStyle w:val="ListParagraph"/>
         <w:numPr>
           <w:ilvl w:val="0"/>
-          <w:numId w:val="15"/>
+          <w:numId w:val="16"/>
         </w:numPr>
         <w:spacing w:after="70" w:line="290"/>
         <w:jc w:val="both"/>
@@ -30072,7 +31062,7 @@
         <w:pStyle w:val="ListParagraph"/>
         <w:numPr>
           <w:ilvl w:val="0"/>
-          <w:numId w:val="15"/>
+          <w:numId w:val="16"/>
         </w:numPr>
         <w:spacing w:after="70" w:line="290"/>
         <w:jc w:val="both"/>
@@ -30101,7 +31091,7 @@
         <w:pStyle w:val="ListParagraph"/>
         <w:numPr>
           <w:ilvl w:val="0"/>
-          <w:numId w:val="15"/>
+          <w:numId w:val="16"/>
         </w:numPr>
         <w:spacing w:after="70" w:line="290"/>
         <w:jc w:val="both"/>
@@ -33856,43 +34846,49 @@
     </w:lvlOverride>
   </w:num>
   <w:num w:numId="9">
-    <w:abstractNumId w:val="27"/>
+    <w:abstractNumId w:val="25"/>
     <w:lvlOverride w:ilvl="0">
       <w:startOverride w:val="1"/>
     </w:lvlOverride>
   </w:num>
   <w:num w:numId="10">
-    <w:abstractNumId w:val="36"/>
+    <w:abstractNumId w:val="32"/>
     <w:lvlOverride w:ilvl="0">
       <w:startOverride w:val="1"/>
     </w:lvlOverride>
   </w:num>
   <w:num w:numId="11">
-    <w:abstractNumId w:val="40"/>
+    <w:abstractNumId w:val="41"/>
     <w:lvlOverride w:ilvl="0">
       <w:startOverride w:val="1"/>
     </w:lvlOverride>
   </w:num>
   <w:num w:numId="12">
-    <w:abstractNumId w:val="52"/>
+    <w:abstractNumId w:val="45"/>
     <w:lvlOverride w:ilvl="0">
       <w:startOverride w:val="1"/>
     </w:lvlOverride>
   </w:num>
   <w:num w:numId="13">
-    <w:abstractNumId w:val="53"/>
+    <w:abstractNumId w:val="57"/>
     <w:lvlOverride w:ilvl="0">
       <w:startOverride w:val="1"/>
     </w:lvlOverride>
   </w:num>
   <w:num w:numId="14">
-    <w:abstractNumId w:val="57"/>
+    <w:abstractNumId w:val="58"/>
     <w:lvlOverride w:ilvl="0">
       <w:startOverride w:val="1"/>
     </w:lvlOverride>
   </w:num>
   <w:num w:numId="15">
-    <w:abstractNumId w:val="72"/>
+    <w:abstractNumId w:val="62"/>
+    <w:lvlOverride w:ilvl="0">
+      <w:startOverride w:val="1"/>
+    </w:lvlOverride>
+  </w:num>
+  <w:num w:numId="16">
+    <w:abstractNumId w:val="77"/>
     <w:lvlOverride w:ilvl="0">
       <w:startOverride w:val="1"/>
     </w:lvlOverride>

</xml_diff>